<commit_message>
chore(eval): re-render on the merged model the folders that changed on master since serial lane 2 branched, part 03 (fb-595.54.82)
</commit_message>
<xml_diff>
--- a/courts/fourth-circuit/north-carolina/state/court-of-appeals/reply-brief/usage/OUTPUT-reply-brief.docx
+++ b/courts/fourth-circuit/north-carolina/state/court-of-appeals/reply-brief/usage/OUTPUT-reply-brief.docx
@@ -933,7 +933,7 @@
     </w:p>
     <w:p>
       <w:pPr>
-        <w:pStyle w:val="BodyText"/>
+        <w:pStyle w:val="BodyTextKeep"/>
       </w:pPr>
       <w:r>
         <w:t xml:space="preserve">This Court should reverse the District Court’s decision, vacate the no-contact order, and clarify that the First Amendment does not permit the imposition of a gag order under § 50C.</w:t>
@@ -941,6 +941,8 @@
     </w:p>
     <w:p>
       <w:pPr>
+        <w:keepNext/>
+        <w:keepLines/>
         <w:spacing w:before="0" w:after="0" w:line="576" w:lineRule="exact"/>
       </w:pPr>
     </w:p>
@@ -4428,6 +4430,15 @@
     <w:pPr>
       <w:spacing w:before="0" w:after="0" w:line="276" w:lineRule="exact"/>
       <w:ind w:firstLine="0"/>
+    </w:pPr>
+  </w:style>
+  <w:style w:type="paragraph" w:customStyle="1" w:styleId="BodyTextKeep">
+    <w:name w:val="Body Text Keep"/>
+    <w:basedOn w:val="BodyText"/>
+    <w:qFormat/>
+    <w:pPr>
+      <w:keepNext/>
+      <w:keepLines/>
     </w:pPr>
   </w:style>
   <w:style w:type="paragraph" w:customStyle="1" w:styleId="XdList1">

</xml_diff>